<commit_message>
Ajuste no uso de Backend e Autenticação
</commit_message>
<xml_diff>
--- a/docs/Documentação do Projeto.docx
+++ b/docs/Documentação do Projeto.docx
@@ -3,21 +3,14 @@
 <w:document xmlns:wpc="http://schemas.microsoft.com/office/word/2010/wordprocessingCanvas" xmlns:cx="http://schemas.microsoft.com/office/drawing/2014/chartex" xmlns:cx1="http://schemas.microsoft.com/office/drawing/2015/9/8/chartex" xmlns:cx2="http://schemas.microsoft.com/office/drawing/2015/10/21/chartex" xmlns:cx3="http://schemas.microsoft.com/office/drawing/2016/5/9/chartex" xmlns:cx4="http://schemas.microsoft.com/office/drawing/2016/5/10/chartex" xmlns:cx5="http://schemas.microsoft.com/office/drawing/2016/5/11/chartex" xmlns:cx6="http://schemas.microsoft.com/office/drawing/2016/5/12/chartex" xmlns:cx7="http://schemas.microsoft.com/office/drawing/2016/5/13/chartex" xmlns:cx8="http://schemas.microsoft.com/office/drawing/2016/5/14/chartex" xmlns:mc="http://schemas.openxmlformats.org/markup-compatibility/2006" xmlns:aink="http://schemas.microsoft.com/office/drawing/2016/ink" xmlns:am3d="http://schemas.microsoft.com/office/drawing/2017/model3d" xmlns:o="urn:schemas-microsoft-com:office:office" xmlns:oel="http://schemas.microsoft.com/office/2019/extlst" xmlns:r="http://schemas.openxmlformats.org/officeDocument/2006/relationships" xmlns:m="http://schemas.openxmlformats.org/officeDocument/2006/math" xmlns:v="urn:schemas-microsoft-com:vml" xmlns:wp14="http://schemas.microsoft.com/office/word/2010/wordprocessingDrawing" xmlns:wp="http://schemas.openxmlformats.org/drawingml/2006/wordprocessingDrawing" xmlns:w10="urn:schemas-microsoft-com:office:word" xmlns:w="http://schemas.openxmlformats.org/wordprocessingml/2006/main" xmlns:w14="http://schemas.microsoft.com/office/word/2010/wordml" xmlns:w15="http://schemas.microsoft.com/office/word/2012/wordml" xmlns:w16cex="http://schemas.microsoft.com/office/word/2018/wordml/cex" xmlns:w16cid="http://schemas.microsoft.com/office/word/2016/wordml/cid" xmlns:w16="http://schemas.microsoft.com/office/word/2018/wordml" xmlns:w16du="http://schemas.microsoft.com/office/word/2023/wordml/word16du" xmlns:w16sdtdh="http://schemas.microsoft.com/office/word/2020/wordml/sdtdatahash" xmlns:w16sdtfl="http://schemas.microsoft.com/office/word/2024/wordml/sdtformatlock" xmlns:w16se="http://schemas.microsoft.com/office/word/2015/wordml/symex" xmlns:wpg="http://schemas.microsoft.com/office/word/2010/wordprocessingGroup" xmlns:wpi="http://schemas.microsoft.com/office/word/2010/wordprocessingInk" xmlns:wne="http://schemas.microsoft.com/office/word/2006/wordml" xmlns:wps="http://schemas.microsoft.com/office/word/2010/wordprocessingShape" mc:Ignorable="w14 w15 w16se w16cid w16 w16cex w16sdtdh w16sdtfl w16du wp14">
   <w:body>
     <w:p>
-      <w:proofErr w:type="gramStart"/>
       <w:r>
         <w:t>Pós Graduação</w:t>
       </w:r>
-      <w:proofErr w:type="gramEnd"/>
-    </w:p>
-    <w:p>
-      <w:r>
-        <w:t xml:space="preserve">Aluna: Fernanda </w:t>
-      </w:r>
-      <w:proofErr w:type="spellStart"/>
-      <w:r>
-        <w:t>Forbici</w:t>
-      </w:r>
-      <w:proofErr w:type="spellEnd"/>
+    </w:p>
+    <w:p>
+      <w:r>
+        <w:t>Aluna: Fernanda Forbici</w:t>
+      </w:r>
     </w:p>
     <w:p/>
     <w:p>
@@ -25,15 +18,7 @@
         <w:pStyle w:val="Ttulo1"/>
       </w:pPr>
       <w:r>
-        <w:t xml:space="preserve">Documentação do Projeto – Tech </w:t>
-      </w:r>
-      <w:proofErr w:type="spellStart"/>
-      <w:r>
-        <w:t>Challenge</w:t>
-      </w:r>
-      <w:proofErr w:type="spellEnd"/>
-      <w:r>
-        <w:t xml:space="preserve"> Fase 03</w:t>
+        <w:t>Documentação do Projeto – Tech Challenge Fase 03</w:t>
       </w:r>
     </w:p>
     <w:p>
@@ -46,15 +31,7 @@
     </w:p>
     <w:p>
       <w:r>
-        <w:t xml:space="preserve">Este documento apresenta a arquitetura, as decisões técnicas, o modo de uso e os desafios enfrentados no desenvolvimento da interface gráfica da aplicação de </w:t>
-      </w:r>
-      <w:proofErr w:type="spellStart"/>
-      <w:r>
-        <w:t>blogging</w:t>
-      </w:r>
-      <w:proofErr w:type="spellEnd"/>
-      <w:r>
-        <w:t>.</w:t>
+        <w:t>Este documento apresenta a arquitetura, as decisões técnicas, o modo de uso e os desafios enfrentados no desenvolvimento da interface gráfica da aplicação de blogging.</w:t>
       </w:r>
     </w:p>
     <w:p/>
@@ -69,23 +46,7 @@
     <w:p/>
     <w:p>
       <w:r>
-        <w:t>Desenvolver uma aplicação front-</w:t>
-      </w:r>
-      <w:proofErr w:type="spellStart"/>
-      <w:r>
-        <w:t>end</w:t>
-      </w:r>
-      <w:proofErr w:type="spellEnd"/>
-      <w:r>
-        <w:t xml:space="preserve"> em </w:t>
-      </w:r>
-      <w:proofErr w:type="spellStart"/>
-      <w:r>
-        <w:t>React</w:t>
-      </w:r>
-      <w:proofErr w:type="spellEnd"/>
-      <w:r>
-        <w:t xml:space="preserve"> para permitir a visualização, busca, criação, edição e exclusão de postagens, com controle de acesso para professores autenticados.</w:t>
+        <w:t>Desenvolver uma aplicação front-end em React para permitir a visualização, busca, criação, edição e exclusão de postagens, com controle de acesso para professores autenticados.</w:t>
       </w:r>
     </w:p>
     <w:p/>
@@ -100,30 +61,8 @@
         <w:rPr>
           <w:lang w:val="en-US"/>
         </w:rPr>
-        <w:t xml:space="preserve">3. </w:t>
-      </w:r>
-      <w:proofErr w:type="spellStart"/>
-      <w:r>
-        <w:rPr>
-          <w:lang w:val="en-US"/>
-        </w:rPr>
-        <w:t>Tecnologias</w:t>
-      </w:r>
-      <w:proofErr w:type="spellEnd"/>
-      <w:r>
-        <w:rPr>
-          <w:lang w:val="en-US"/>
-        </w:rPr>
-        <w:t xml:space="preserve"> </w:t>
-      </w:r>
-      <w:proofErr w:type="spellStart"/>
-      <w:r>
-        <w:rPr>
-          <w:lang w:val="en-US"/>
-        </w:rPr>
-        <w:t>utilizadas</w:t>
-      </w:r>
-      <w:proofErr w:type="spellEnd"/>
+        <w:t>3. Tecnologias utilizadas</w:t>
+      </w:r>
     </w:p>
     <w:p>
       <w:pPr>
@@ -244,14 +183,12 @@
           <w:lang w:val="en-US"/>
         </w:rPr>
       </w:pPr>
-      <w:proofErr w:type="spellStart"/>
       <w:r>
         <w:rPr>
           <w:lang w:val="en-US"/>
         </w:rPr>
         <w:t>Formik</w:t>
       </w:r>
-      <w:proofErr w:type="spellEnd"/>
     </w:p>
     <w:p>
       <w:pPr>
@@ -282,14 +219,12 @@
           <w:lang w:val="en-US"/>
         </w:rPr>
       </w:pPr>
-      <w:proofErr w:type="spellStart"/>
       <w:r>
         <w:rPr>
           <w:lang w:val="en-US"/>
         </w:rPr>
         <w:t>Vitest</w:t>
       </w:r>
-      <w:proofErr w:type="spellEnd"/>
     </w:p>
     <w:p>
       <w:pPr>
@@ -318,13 +253,8 @@
         </w:numPr>
       </w:pPr>
       <w:r>
-        <w:t xml:space="preserve">GitHub </w:t>
-      </w:r>
-      <w:proofErr w:type="spellStart"/>
-      <w:r>
-        <w:t>Actions</w:t>
-      </w:r>
-      <w:proofErr w:type="spellEnd"/>
+        <w:t>GitHub Actions</w:t>
+      </w:r>
     </w:p>
     <w:p/>
     <w:p>
@@ -357,6 +287,229 @@
         <w:t>Até o momento, foram estruturadas as rotas principais e a listagem inicial de posts com dados temporários.</w:t>
       </w:r>
     </w:p>
+    <w:p>
+      <w:pPr>
+        <w:pStyle w:val="Ttulo2"/>
+      </w:pPr>
+      <w:r>
+        <w:t>6. Integração com o back-end</w:t>
+      </w:r>
+    </w:p>
+    <w:p>
+      <w:r>
+        <w:t>A comunicação com o back-end é feita por meio da biblioteca Axios. A configuração central da API está no arquivo `src/services/api.ts`, enquanto as operações relacionadas a posts estão concentradas em `src/services/postService.ts`.</w:t>
+      </w:r>
+    </w:p>
+    <w:p>
+      <w:r>
+        <w:t>Endpoints previstos:</w:t>
+      </w:r>
+    </w:p>
+    <w:tbl>
+      <w:tblPr>
+        <w:tblStyle w:val="Tabelacomgrade"/>
+        <w:tblW w:w="0" w:type="auto"/>
+        <w:tblLook w:val="04A0" w:firstRow="1" w:lastRow="0" w:firstColumn="1" w:lastColumn="0" w:noHBand="0" w:noVBand="1"/>
+      </w:tblPr>
+      <w:tblGrid>
+        <w:gridCol w:w="2831"/>
+        <w:gridCol w:w="2831"/>
+        <w:gridCol w:w="2832"/>
+      </w:tblGrid>
+      <w:tr>
+        <w:tc>
+          <w:tcPr>
+            <w:tcW w:w="2831" w:type="dxa"/>
+          </w:tcPr>
+          <w:p>
+            <w:r>
+              <w:t>Método</w:t>
+            </w:r>
+          </w:p>
+        </w:tc>
+        <w:tc>
+          <w:tcPr>
+            <w:tcW w:w="2831" w:type="dxa"/>
+          </w:tcPr>
+          <w:p>
+            <w:r>
+              <w:t>Endpoint</w:t>
+            </w:r>
+          </w:p>
+        </w:tc>
+        <w:tc>
+          <w:tcPr>
+            <w:tcW w:w="2832" w:type="dxa"/>
+          </w:tcPr>
+          <w:p>
+            <w:r>
+              <w:t>Finalidade</w:t>
+            </w:r>
+          </w:p>
+        </w:tc>
+      </w:tr>
+      <w:tr>
+        <w:tc>
+          <w:tcPr>
+            <w:tcW w:w="2831" w:type="dxa"/>
+          </w:tcPr>
+          <w:p>
+            <w:r>
+              <w:t>GET</w:t>
+            </w:r>
+          </w:p>
+        </w:tc>
+        <w:tc>
+          <w:tcPr>
+            <w:tcW w:w="2831" w:type="dxa"/>
+          </w:tcPr>
+          <w:p>
+            <w:r>
+              <w:t>`/post`</w:t>
+            </w:r>
+          </w:p>
+        </w:tc>
+        <w:tc>
+          <w:tcPr>
+            <w:tcW w:w="2832" w:type="dxa"/>
+          </w:tcPr>
+          <w:p>
+            <w:r>
+              <w:t>Listar posts</w:t>
+            </w:r>
+          </w:p>
+        </w:tc>
+      </w:tr>
+      <w:tr>
+        <w:tc>
+          <w:tcPr>
+            <w:tcW w:w="2831" w:type="dxa"/>
+          </w:tcPr>
+          <w:p>
+            <w:r>
+              <w:t>GET</w:t>
+            </w:r>
+          </w:p>
+        </w:tc>
+        <w:tc>
+          <w:tcPr>
+            <w:tcW w:w="2831" w:type="dxa"/>
+          </w:tcPr>
+          <w:p>
+            <w:r>
+              <w:t>`/posts/:id`</w:t>
+            </w:r>
+          </w:p>
+        </w:tc>
+        <w:tc>
+          <w:tcPr>
+            <w:tcW w:w="2832" w:type="dxa"/>
+          </w:tcPr>
+          <w:p>
+            <w:r>
+              <w:t>Buscar posts por ID</w:t>
+            </w:r>
+          </w:p>
+        </w:tc>
+      </w:tr>
+      <w:tr>
+        <w:tc>
+          <w:tcPr>
+            <w:tcW w:w="2831" w:type="dxa"/>
+          </w:tcPr>
+          <w:p>
+            <w:r>
+              <w:t>POST</w:t>
+            </w:r>
+          </w:p>
+        </w:tc>
+        <w:tc>
+          <w:tcPr>
+            <w:tcW w:w="2831" w:type="dxa"/>
+          </w:tcPr>
+          <w:p>
+            <w:r>
+              <w:t>`/posts`</w:t>
+            </w:r>
+          </w:p>
+        </w:tc>
+        <w:tc>
+          <w:tcPr>
+            <w:tcW w:w="2832" w:type="dxa"/>
+          </w:tcPr>
+          <w:p>
+            <w:r>
+              <w:t>Criar post</w:t>
+            </w:r>
+          </w:p>
+        </w:tc>
+      </w:tr>
+      <w:tr>
+        <w:tc>
+          <w:tcPr>
+            <w:tcW w:w="2831" w:type="dxa"/>
+          </w:tcPr>
+          <w:p>
+            <w:r>
+              <w:t>PUT</w:t>
+            </w:r>
+          </w:p>
+        </w:tc>
+        <w:tc>
+          <w:tcPr>
+            <w:tcW w:w="2831" w:type="dxa"/>
+          </w:tcPr>
+          <w:p>
+            <w:r>
+              <w:t>`/posts/:id`</w:t>
+            </w:r>
+          </w:p>
+        </w:tc>
+        <w:tc>
+          <w:tcPr>
+            <w:tcW w:w="2832" w:type="dxa"/>
+          </w:tcPr>
+          <w:p>
+            <w:r>
+              <w:t>Atualizar post</w:t>
+            </w:r>
+          </w:p>
+        </w:tc>
+      </w:tr>
+      <w:tr>
+        <w:tc>
+          <w:tcPr>
+            <w:tcW w:w="2831" w:type="dxa"/>
+          </w:tcPr>
+          <w:p>
+            <w:r>
+              <w:t>DELETE</w:t>
+            </w:r>
+          </w:p>
+        </w:tc>
+        <w:tc>
+          <w:tcPr>
+            <w:tcW w:w="2831" w:type="dxa"/>
+          </w:tcPr>
+          <w:p>
+            <w:r>
+              <w:t>`/posts/:id`</w:t>
+            </w:r>
+          </w:p>
+        </w:tc>
+        <w:tc>
+          <w:tcPr>
+            <w:tcW w:w="2832" w:type="dxa"/>
+          </w:tcPr>
+          <w:p>
+            <w:r>
+              <w:t>Excluir post</w:t>
+            </w:r>
+          </w:p>
+        </w:tc>
+      </w:tr>
+    </w:tbl>
+    <w:p/>
     <w:sectPr>
       <w:pgSz w:w="11906" w:h="16838"/>
       <w:pgMar w:top="1417" w:right="1701" w:bottom="1417" w:left="1701" w:header="708" w:footer="708" w:gutter="0"/>
@@ -1403,6 +1556,25 @@
       <w:spacing w:val="5"/>
     </w:rPr>
   </w:style>
+  <w:style w:type="table" w:styleId="Tabelacomgrade">
+    <w:name w:val="Table Grid"/>
+    <w:basedOn w:val="Tabelanormal"/>
+    <w:uiPriority w:val="39"/>
+    <w:rsid w:val="0034258A"/>
+    <w:pPr>
+      <w:spacing w:after="0" w:line="240" w:lineRule="auto"/>
+    </w:pPr>
+    <w:tblPr>
+      <w:tblBorders>
+        <w:top w:val="single" w:sz="4" w:space="0" w:color="auto"/>
+        <w:left w:val="single" w:sz="4" w:space="0" w:color="auto"/>
+        <w:bottom w:val="single" w:sz="4" w:space="0" w:color="auto"/>
+        <w:right w:val="single" w:sz="4" w:space="0" w:color="auto"/>
+        <w:insideH w:val="single" w:sz="4" w:space="0" w:color="auto"/>
+        <w:insideV w:val="single" w:sz="4" w:space="0" w:color="auto"/>
+      </w:tblBorders>
+    </w:tblPr>
+  </w:style>
 </w:styles>
 </file>
 

</xml_diff>

<commit_message>
correção do css e do docker
</commit_message>
<xml_diff>
--- a/docs/Documentação do Projeto.docx
+++ b/docs/Documentação do Projeto.docx
@@ -3,14 +3,21 @@
 <w:document xmlns:wpc="http://schemas.microsoft.com/office/word/2010/wordprocessingCanvas" xmlns:cx="http://schemas.microsoft.com/office/drawing/2014/chartex" xmlns:cx1="http://schemas.microsoft.com/office/drawing/2015/9/8/chartex" xmlns:cx2="http://schemas.microsoft.com/office/drawing/2015/10/21/chartex" xmlns:cx3="http://schemas.microsoft.com/office/drawing/2016/5/9/chartex" xmlns:cx4="http://schemas.microsoft.com/office/drawing/2016/5/10/chartex" xmlns:cx5="http://schemas.microsoft.com/office/drawing/2016/5/11/chartex" xmlns:cx6="http://schemas.microsoft.com/office/drawing/2016/5/12/chartex" xmlns:cx7="http://schemas.microsoft.com/office/drawing/2016/5/13/chartex" xmlns:cx8="http://schemas.microsoft.com/office/drawing/2016/5/14/chartex" xmlns:mc="http://schemas.openxmlformats.org/markup-compatibility/2006" xmlns:aink="http://schemas.microsoft.com/office/drawing/2016/ink" xmlns:am3d="http://schemas.microsoft.com/office/drawing/2017/model3d" xmlns:o="urn:schemas-microsoft-com:office:office" xmlns:oel="http://schemas.microsoft.com/office/2019/extlst" xmlns:r="http://schemas.openxmlformats.org/officeDocument/2006/relationships" xmlns:m="http://schemas.openxmlformats.org/officeDocument/2006/math" xmlns:v="urn:schemas-microsoft-com:vml" xmlns:wp14="http://schemas.microsoft.com/office/word/2010/wordprocessingDrawing" xmlns:wp="http://schemas.openxmlformats.org/drawingml/2006/wordprocessingDrawing" xmlns:w10="urn:schemas-microsoft-com:office:word" xmlns:w="http://schemas.openxmlformats.org/wordprocessingml/2006/main" xmlns:w14="http://schemas.microsoft.com/office/word/2010/wordml" xmlns:w15="http://schemas.microsoft.com/office/word/2012/wordml" xmlns:w16cex="http://schemas.microsoft.com/office/word/2018/wordml/cex" xmlns:w16cid="http://schemas.microsoft.com/office/word/2016/wordml/cid" xmlns:w16="http://schemas.microsoft.com/office/word/2018/wordml" xmlns:w16du="http://schemas.microsoft.com/office/word/2023/wordml/word16du" xmlns:w16sdtdh="http://schemas.microsoft.com/office/word/2020/wordml/sdtdatahash" xmlns:w16sdtfl="http://schemas.microsoft.com/office/word/2024/wordml/sdtformatlock" xmlns:w16se="http://schemas.microsoft.com/office/word/2015/wordml/symex" xmlns:wpg="http://schemas.microsoft.com/office/word/2010/wordprocessingGroup" xmlns:wpi="http://schemas.microsoft.com/office/word/2010/wordprocessingInk" xmlns:wne="http://schemas.microsoft.com/office/word/2006/wordml" xmlns:wps="http://schemas.microsoft.com/office/word/2010/wordprocessingShape" mc:Ignorable="w14 w15 w16se w16cid w16 w16cex w16sdtdh w16sdtfl w16du wp14">
   <w:body>
     <w:p>
+      <w:proofErr w:type="gramStart"/>
       <w:r>
         <w:t>Pós Graduação</w:t>
       </w:r>
-    </w:p>
-    <w:p>
-      <w:r>
-        <w:t>Aluna: Fernanda Forbici</w:t>
-      </w:r>
+      <w:proofErr w:type="gramEnd"/>
+    </w:p>
+    <w:p>
+      <w:r>
+        <w:t xml:space="preserve">Aluna: Fernanda </w:t>
+      </w:r>
+      <w:proofErr w:type="spellStart"/>
+      <w:r>
+        <w:t>Forbici</w:t>
+      </w:r>
+      <w:proofErr w:type="spellEnd"/>
     </w:p>
     <w:p/>
     <w:p>
@@ -18,7 +25,15 @@
         <w:pStyle w:val="Ttulo1"/>
       </w:pPr>
       <w:r>
-        <w:t>Documentação do Projeto – Tech Challenge Fase 03</w:t>
+        <w:t xml:space="preserve">Documentação do Projeto – Tech </w:t>
+      </w:r>
+      <w:proofErr w:type="spellStart"/>
+      <w:r>
+        <w:t>Challenge</w:t>
+      </w:r>
+      <w:proofErr w:type="spellEnd"/>
+      <w:r>
+        <w:t xml:space="preserve"> Fase 03</w:t>
       </w:r>
     </w:p>
     <w:p>
@@ -31,7 +46,15 @@
     </w:p>
     <w:p>
       <w:r>
-        <w:t>Este documento apresenta a arquitetura, as decisões técnicas, o modo de uso e os desafios enfrentados no desenvolvimento da interface gráfica da aplicação de blogging.</w:t>
+        <w:t xml:space="preserve">Este documento apresenta a arquitetura, as decisões técnicas, o modo de uso e os desafios enfrentados no desenvolvimento da interface gráfica da aplicação de </w:t>
+      </w:r>
+      <w:proofErr w:type="spellStart"/>
+      <w:r>
+        <w:t>blogging</w:t>
+      </w:r>
+      <w:proofErr w:type="spellEnd"/>
+      <w:r>
+        <w:t>.</w:t>
       </w:r>
     </w:p>
     <w:p/>
@@ -46,7 +69,23 @@
     <w:p/>
     <w:p>
       <w:r>
-        <w:t>Desenvolver uma aplicação front-end em React para permitir a visualização, busca, criação, edição e exclusão de postagens, com controle de acesso para professores autenticados.</w:t>
+        <w:t>Desenvolver uma aplicação front-</w:t>
+      </w:r>
+      <w:proofErr w:type="spellStart"/>
+      <w:r>
+        <w:t>end</w:t>
+      </w:r>
+      <w:proofErr w:type="spellEnd"/>
+      <w:r>
+        <w:t xml:space="preserve"> em </w:t>
+      </w:r>
+      <w:proofErr w:type="spellStart"/>
+      <w:r>
+        <w:t>React</w:t>
+      </w:r>
+      <w:proofErr w:type="spellEnd"/>
+      <w:r>
+        <w:t xml:space="preserve"> para permitir a visualização, busca, criação, edição e exclusão de postagens, com controle de acesso para professores autenticados.</w:t>
       </w:r>
     </w:p>
     <w:p/>
@@ -61,8 +100,30 @@
         <w:rPr>
           <w:lang w:val="en-US"/>
         </w:rPr>
-        <w:t>3. Tecnologias utilizadas</w:t>
-      </w:r>
+        <w:t xml:space="preserve">3. </w:t>
+      </w:r>
+      <w:proofErr w:type="spellStart"/>
+      <w:r>
+        <w:rPr>
+          <w:lang w:val="en-US"/>
+        </w:rPr>
+        <w:t>Tecnologias</w:t>
+      </w:r>
+      <w:proofErr w:type="spellEnd"/>
+      <w:r>
+        <w:rPr>
+          <w:lang w:val="en-US"/>
+        </w:rPr>
+        <w:t xml:space="preserve"> </w:t>
+      </w:r>
+      <w:proofErr w:type="spellStart"/>
+      <w:r>
+        <w:rPr>
+          <w:lang w:val="en-US"/>
+        </w:rPr>
+        <w:t>utilizadas</w:t>
+      </w:r>
+      <w:proofErr w:type="spellEnd"/>
     </w:p>
     <w:p>
       <w:pPr>
@@ -183,12 +244,14 @@
           <w:lang w:val="en-US"/>
         </w:rPr>
       </w:pPr>
+      <w:proofErr w:type="spellStart"/>
       <w:r>
         <w:rPr>
           <w:lang w:val="en-US"/>
         </w:rPr>
         <w:t>Formik</w:t>
       </w:r>
+      <w:proofErr w:type="spellEnd"/>
     </w:p>
     <w:p>
       <w:pPr>
@@ -219,12 +282,14 @@
           <w:lang w:val="en-US"/>
         </w:rPr>
       </w:pPr>
+      <w:proofErr w:type="spellStart"/>
       <w:r>
         <w:rPr>
           <w:lang w:val="en-US"/>
         </w:rPr>
         <w:t>Vitest</w:t>
       </w:r>
+      <w:proofErr w:type="spellEnd"/>
     </w:p>
     <w:p>
       <w:pPr>
@@ -253,8 +318,13 @@
         </w:numPr>
       </w:pPr>
       <w:r>
-        <w:t>GitHub Actions</w:t>
-      </w:r>
+        <w:t xml:space="preserve">GitHub </w:t>
+      </w:r>
+      <w:proofErr w:type="spellStart"/>
+      <w:r>
+        <w:t>Actions</w:t>
+      </w:r>
+      <w:proofErr w:type="spellEnd"/>
     </w:p>
     <w:p/>
     <w:p>
@@ -292,17 +362,91 @@
         <w:pStyle w:val="Ttulo2"/>
       </w:pPr>
       <w:r>
-        <w:t>6. Integração com o back-end</w:t>
-      </w:r>
-    </w:p>
-    <w:p>
-      <w:r>
-        <w:t>A comunicação com o back-end é feita por meio da biblioteca Axios. A configuração central da API está no arquivo `src/services/api.ts`, enquanto as operações relacionadas a posts estão concentradas em `src/services/postService.ts`.</w:t>
-      </w:r>
-    </w:p>
-    <w:p>
-      <w:r>
-        <w:t>Endpoints previstos:</w:t>
+        <w:t xml:space="preserve">6. Integração com o </w:t>
+      </w:r>
+      <w:proofErr w:type="spellStart"/>
+      <w:r>
+        <w:t>back-end</w:t>
+      </w:r>
+      <w:proofErr w:type="spellEnd"/>
+    </w:p>
+    <w:p>
+      <w:r>
+        <w:t xml:space="preserve">A comunicação com o </w:t>
+      </w:r>
+      <w:proofErr w:type="spellStart"/>
+      <w:r>
+        <w:t>back-end</w:t>
+      </w:r>
+      <w:proofErr w:type="spellEnd"/>
+      <w:r>
+        <w:t xml:space="preserve"> é feita por meio da biblioteca </w:t>
+      </w:r>
+      <w:proofErr w:type="spellStart"/>
+      <w:r>
+        <w:t>Axios</w:t>
+      </w:r>
+      <w:proofErr w:type="spellEnd"/>
+      <w:r>
+        <w:t>. A configuração central da API está no arquivo `</w:t>
+      </w:r>
+      <w:proofErr w:type="spellStart"/>
+      <w:r>
+        <w:t>src</w:t>
+      </w:r>
+      <w:proofErr w:type="spellEnd"/>
+      <w:r>
+        <w:t>/</w:t>
+      </w:r>
+      <w:proofErr w:type="spellStart"/>
+      <w:r>
+        <w:t>services</w:t>
+      </w:r>
+      <w:proofErr w:type="spellEnd"/>
+      <w:r>
+        <w:t>/</w:t>
+      </w:r>
+      <w:proofErr w:type="spellStart"/>
+      <w:r>
+        <w:t>api.ts</w:t>
+      </w:r>
+      <w:proofErr w:type="spellEnd"/>
+      <w:r>
+        <w:t>`, enquanto as operações relacionadas a posts estão concentradas em `</w:t>
+      </w:r>
+      <w:proofErr w:type="spellStart"/>
+      <w:r>
+        <w:t>src</w:t>
+      </w:r>
+      <w:proofErr w:type="spellEnd"/>
+      <w:r>
+        <w:t>/</w:t>
+      </w:r>
+      <w:proofErr w:type="spellStart"/>
+      <w:r>
+        <w:t>services</w:t>
+      </w:r>
+      <w:proofErr w:type="spellEnd"/>
+      <w:r>
+        <w:t>/</w:t>
+      </w:r>
+      <w:proofErr w:type="spellStart"/>
+      <w:r>
+        <w:t>postService.ts</w:t>
+      </w:r>
+      <w:proofErr w:type="spellEnd"/>
+      <w:r>
+        <w:t>`.</w:t>
+      </w:r>
+    </w:p>
+    <w:p>
+      <w:proofErr w:type="spellStart"/>
+      <w:r>
+        <w:t>Endpoints</w:t>
+      </w:r>
+      <w:proofErr w:type="spellEnd"/>
+      <w:r>
+        <w:t xml:space="preserve"> previstos:</w:t>
       </w:r>
     </w:p>
     <w:tbl>
@@ -332,9 +476,11 @@
             <w:tcW w:w="2831" w:type="dxa"/>
           </w:tcPr>
           <w:p>
+            <w:proofErr w:type="spellStart"/>
             <w:r>
               <w:t>Endpoint</w:t>
             </w:r>
+            <w:proofErr w:type="spellEnd"/>
           </w:p>
         </w:tc>
         <w:tc>
@@ -354,9 +500,11 @@
             <w:tcW w:w="2831" w:type="dxa"/>
           </w:tcPr>
           <w:p>
+            <w:proofErr w:type="spellStart"/>
             <w:r>
               <w:t>GET</w:t>
             </w:r>
+            <w:proofErr w:type="spellEnd"/>
           </w:p>
         </w:tc>
         <w:tc>
@@ -386,9 +534,11 @@
             <w:tcW w:w="2831" w:type="dxa"/>
           </w:tcPr>
           <w:p>
+            <w:proofErr w:type="spellStart"/>
             <w:r>
               <w:t>GET</w:t>
             </w:r>
+            <w:proofErr w:type="spellEnd"/>
           </w:p>
         </w:tc>
         <w:tc>
@@ -450,9 +600,11 @@
             <w:tcW w:w="2831" w:type="dxa"/>
           </w:tcPr>
           <w:p>
+            <w:proofErr w:type="spellStart"/>
             <w:r>
               <w:t>PUT</w:t>
             </w:r>
+            <w:proofErr w:type="spellEnd"/>
           </w:p>
         </w:tc>
         <w:tc>
@@ -510,6 +662,86 @@
       </w:tr>
     </w:tbl>
     <w:p/>
+    <w:p>
+      <w:pPr>
+        <w:pStyle w:val="Ttulo2"/>
+      </w:pPr>
+      <w:r>
+        <w:t>7. Autenticação e autorização</w:t>
+      </w:r>
+    </w:p>
+    <w:p>
+      <w:r>
+        <w:t xml:space="preserve">A autenticação é realizada por meio de uma tela de login para professores. Após o login bem-sucedido, o token retornado pelo </w:t>
+      </w:r>
+      <w:proofErr w:type="spellStart"/>
+      <w:r>
+        <w:t>back-end</w:t>
+      </w:r>
+      <w:proofErr w:type="spellEnd"/>
+      <w:r>
+        <w:t xml:space="preserve"> é armazenado no Local </w:t>
+      </w:r>
+      <w:proofErr w:type="spellStart"/>
+      <w:r>
+        <w:t>Storage</w:t>
+      </w:r>
+      <w:proofErr w:type="spellEnd"/>
+      <w:r>
+        <w:t>.</w:t>
+      </w:r>
+    </w:p>
+    <w:p>
+      <w:r>
+        <w:t>As rotas administrativas são protegidas por um componente `</w:t>
+      </w:r>
+      <w:proofErr w:type="spellStart"/>
+      <w:r>
+        <w:t>ProtectedRoute</w:t>
+      </w:r>
+      <w:proofErr w:type="spellEnd"/>
+      <w:r>
+        <w:t>`, que verifica se o usuário possui token antes de permitir o acesso.</w:t>
+      </w:r>
+    </w:p>
+    <w:p>
+      <w:pPr>
+        <w:rPr>
+          <w:b/>
+          <w:bCs/>
+        </w:rPr>
+      </w:pPr>
+      <w:r>
+        <w:rPr>
+          <w:b/>
+          <w:bCs/>
+        </w:rPr>
+        <w:t>Rotas protegidas:</w:t>
+      </w:r>
+    </w:p>
+    <w:p>
+      <w:r>
+        <w:t>- `/admin`</w:t>
+      </w:r>
+    </w:p>
+    <w:p>
+      <w:r>
+        <w:t>- `/posts/new`</w:t>
+      </w:r>
+    </w:p>
+    <w:p>
+      <w:r>
+        <w:t>- `/posts/:id/</w:t>
+      </w:r>
+      <w:proofErr w:type="spellStart"/>
+      <w:r>
+        <w:t>edit</w:t>
+      </w:r>
+      <w:proofErr w:type="spellEnd"/>
+      <w:r>
+        <w:t>`</w:t>
+      </w:r>
+    </w:p>
     <w:sectPr>
       <w:pgSz w:w="11906" w:h="16838"/>
       <w:pgMar w:top="1417" w:right="1701" w:bottom="1417" w:left="1701" w:header="708" w:footer="708" w:gutter="0"/>

</xml_diff>

<commit_message>
refatoração para usar backend do tech challenge fase 2
</commit_message>
<xml_diff>
--- a/docs/Documentação do Projeto.docx
+++ b/docs/Documentação do Projeto.docx
@@ -748,10 +748,7 @@
         <w:pStyle w:val="Ttulo2"/>
       </w:pPr>
       <w:r>
-        <w:t>8</w:t>
-      </w:r>
-      <w:r>
-        <w:t>. Responsividade e acessibilidade</w:t>
+        <w:t>8. Responsividade e acessibilidade</w:t>
       </w:r>
     </w:p>
     <w:p>
@@ -812,10 +809,7 @@
       </w:pPr>
       <w:r>
         <w:lastRenderedPageBreak/>
-        <w:t>10</w:t>
-      </w:r>
-      <w:r>
-        <w:t>. Docker</w:t>
+        <w:t>10. Docker</w:t>
       </w:r>
     </w:p>
     <w:p>
@@ -837,6 +831,40 @@
       <w:proofErr w:type="spellEnd"/>
       <w:r>
         <w:t>.</w:t>
+      </w:r>
+    </w:p>
+    <w:p/>
+    <w:p>
+      <w:pPr>
+        <w:pStyle w:val="Ttulo2"/>
+      </w:pPr>
+      <w:r>
+        <w:t>11</w:t>
+      </w:r>
+      <w:r>
+        <w:t>. CI/CD</w:t>
+      </w:r>
+    </w:p>
+    <w:p/>
+    <w:p>
+      <w:r>
+        <w:t xml:space="preserve">Foi configurado um workflow no GitHub </w:t>
+      </w:r>
+      <w:proofErr w:type="spellStart"/>
+      <w:r>
+        <w:t>Actions</w:t>
+      </w:r>
+      <w:proofErr w:type="spellEnd"/>
+      <w:r>
+        <w:t xml:space="preserve"> para instalar dependências, executar testes automatizados e gerar o build da aplicação. Essa configuração contribui para validar alterações antes da integração na </w:t>
+      </w:r>
+      <w:proofErr w:type="spellStart"/>
+      <w:r>
+        <w:t>branch</w:t>
+      </w:r>
+      <w:proofErr w:type="spellEnd"/>
+      <w:r>
+        <w:t xml:space="preserve"> principal.</w:t>
       </w:r>
     </w:p>
     <w:p/>

</xml_diff>